<commit_message>
Q1 per-month test, conclusions tightened
</commit_message>
<xml_diff>
--- a/PCard_assignment_completed.docx
+++ b/PCard_assignment_completed.docx
@@ -4020,7 +4020,7 @@
           <w:sz w:val="20"/>
           <w:szCs w:val="20"/>
         </w:rPr>
-        <w:t xml:space="preserve">Part I sets the $50.000 limit per billing cycle, while this test follows the case and applies it per year, so it flags more cardholders than a true cycle breach would. Even so, spending is highly concentrated. Employee 51914657 and Employee B1FA2F0D spent more than 55 times the annual threshold between them, and their vendors (HVAC contractors, electrical and plumbing suppliers) point to central facilities purchasing roles. Such a volume is possible only with raised limits, so the key evidence is whether those limits were approved. Follow-up: obtain the approved credit limits and the written justification required for limits above $10.000 a month for the top ten cardholders, and check whether any card exceeded $50.000 within a single billing cycle.</w:t>
+        <w:t xml:space="preserve">Part I sets the $50.000 credit limit per billing cycle, while this test follows the case and applies it per year. Most of the 127 hits are therefore not breaches of the policy itself. To test the actual rule, I ran the same query grouped by month, the closest match to a billing cycle in the data (results/Question1_monthly.csv). Seven cardholders spent more than $50.000 in at least one month, 40 cardholder-months in total. Employee 51914657 and Employee B1FA2F0D did so in all twelve months, with up to $176.844,86 in a single month. Part I says the credit limit shall not exceed $50.000, so unlike the $10.000 monthly limit in Control 2, this cannot be explained by an approved increase. Their vendors (HVAC contractors, electrical and plumbing suppliers) point to central facilities purchasing. That may be a real job need, but at this volume it belongs on purchase orders, not a P-card. Follow-up: obtain the card limits set at the bank and the statement dates for the seven cardholders, to confirm whether the limit was set above policy.</w:t>
       </w:r>
     </w:p>
     <w:p>
@@ -6195,7 +6195,7 @@
           <w:sz w:val="20"/>
           <w:szCs w:val="20"/>
         </w:rPr>
-        <w:t xml:space="preserve">69 cardholder-vendor-day groups had more than one charge with a combined total above $5.000 (269 transactions, $484.863,91). In 68 of the 69 groups every individual charge is below $5.000, which is the pattern a split purchase produces. Three cardholders account for 151 of the 269 rows: Employee 51914657 (65), Employee 6A680974 (51) and Employee B1FA2F0D (35). The table shows the textbook case first and then the largest groups.</w:t>
+        <w:t xml:space="preserve">69 cardholder-vendor-day groups had more than one charge with a combined total above $5.000 (269 transactions, $484.863,91). In 68 of the 69 groups every individual charge is below $5.000, which is the pattern a split purchase produces. Three cardholders account for 151 of the 269 rows: Employee 51914657 (65), Employee 6A680974 (51) and Employee B1FA2F0D (35). The table shows the clearest case first and then the largest groups.</w:t>
       </w:r>
     </w:p>
     <w:tbl>
@@ -8959,7 +8959,7 @@
           <w:sz w:val="20"/>
           <w:szCs w:val="20"/>
         </w:rPr>
-        <w:t xml:space="preserve">This test is the weakest of the three. Splitting between vendors needs a divisible purchase, and many hits are simply one large purchase plus an unrelated small one on the same day. A hotel bill plus an airport sandwich is not a split. The test would be sharper if both charges had to exceed, for example, $1.000 and the two vendors had to be in the same merchant category. The hits worth pursuing are pairs of similar, substantial amounts in the same category, such as $6.210,50 and $6.266,53 to two convention service firms on 10.04.2014 by Employee 0E3DD9FC. Follow-up: review the pairs where both charges exceed $1.000 and ask whether the goods or services came from one order.</w:t>
+        <w:t xml:space="preserve">This test is the weakest of the three. Splitting between vendors needs a divisible purchase, and many hits are simply one large purchase plus an unrelated small one on the same day. A hotel bill and an airport sandwich on the same day are two separate purchases. The test would be sharper if both charges had to exceed, for example, $1.000 and the two vendors had to be in the same merchant category. The hits worth pursuing are pairs of similar, substantial amounts in the same category, such as $6.210,50 and $6.266,53 to two convention service firms on 10.04.2014 by Employee 0E3DD9FC. Follow-up: review the pairs where both charges exceed $1.000 and ask whether the goods or services came from one order.</w:t>
       </w:r>
     </w:p>
     <w:p>
@@ -14557,7 +14557,7 @@
           <w:sz w:val="20"/>
           <w:szCs w:val="20"/>
         </w:rPr>
-        <w:t xml:space="preserve">The storage rental ($726,00 in each of 11 months, $7.986,00) is a textbook lease that should be on a purchase order, and BitGravity (a fixed $390,00 a month for a data or hosting service) is a service agreement. The Pikepass charges are prepaid toll account top-ups, not an agreement, so that hit is a false positive. OSU's fiscal year runs from July to June, so a calendar-year test can miss agreements that cross the year end. Follow-up: ask the storage and BitGravity cardholders to move the agreements to purchase orders, and repeat the test on fiscal-year data.</w:t>
+        <w:t xml:space="preserve">The storage rental ($726,00 in each of 11 months, $7.986,00) is clearly a lease that should be on a purchase order, and BitGravity (a fixed $390,00 a month for a data or hosting service) is a service agreement. The Pikepass charges are top-ups of a prepaid toll account, so that hit is a false positive. OSU's fiscal year runs from July to June, so a calendar-year test can miss agreements that cross the year end. Follow-up: ask the storage and BitGravity cardholders to move the agreements to purchase orders, and repeat the test on fiscal-year data.</w:t>
       </w:r>
     </w:p>
     <w:p>
@@ -15485,7 +15485,7 @@
           <w:sz w:val="20"/>
           <w:szCs w:val="20"/>
         </w:rPr>
-        <w:t xml:space="preserve">The most likely explanation for a heavy user who stops abruptly is that the person left the University or changed role. If the card was cancelled at that point, nothing is wrong. The data cannot show card status, so the list is a starting point, not a finding. The risk is that cards belonging to people who have left stay open and can be misused. Cards with no 2014 activity at all do not appear in the data and cannot be tested here. Follow-up: match the list against the bank's card register and HR leaver records, and confirm a cancellation date for every card.</w:t>
+        <w:t xml:space="preserve">The most likely explanation for a heavy user who stops abruptly is that the person left the University or changed role. If the card was cancelled at that point, nothing is wrong. The data cannot show card status, so the list only shows which cards to check. The risk is that cards belonging to people who have left stay open and can be misused. Cards with no 2014 activity at all do not appear in the data and cannot be tested here. Follow-up: match the list against the bank's card register and HR leaver records, and confirm a cancellation date for every card.</w:t>
       </w:r>
     </w:p>
     <w:p>
@@ -18109,7 +18109,7 @@
           <w:sz w:val="20"/>
           <w:szCs w:val="20"/>
         </w:rPr>
-        <w:t xml:space="preserve">Most matches have an innocent explanation. Several mobile data lines are billed the same day at the same price, gas cylinder rentals repeat by nature, and group hotel bookings produce identical room charges. $670.114,68 is therefore an upper bound, not an estimate of loss. The high-value matches deserve an invoice check, for example three charges of $2.665,08 at FedEx Office on 08.08.2014 and two charges of $4.305,00 at Intermountain Lock on 29.08.2014. Follow-up: request invoices for matches above $1.000 and check whether the vendor issued one or several invoices.</w:t>
+        <w:t xml:space="preserve">Most matches have an innocent explanation. Several mobile data lines are billed the same day at the same price, gas cylinder rentals repeat by nature, and group hotel bookings produce identical room charges. $670.114,68 is therefore the most that could have been overpaid, and the real loss is likely far lower. The high-value matches deserve an invoice check, for example three charges of $2.665,08 at FedEx Office on 08.08.2014 and two charges of $4.305,00 at Intermountain Lock on 29.08.2014. Follow-up: request invoices for matches above $1.000 and check whether the vendor issued one or several invoices.</w:t>
       </w:r>
     </w:p>
     <w:p>
@@ -20373,7 +20373,7 @@
           <w:sz w:val="20"/>
           <w:szCs w:val="20"/>
         </w:rPr>
-        <w:t xml:space="preserve">Staying under a limit is not wrong in itself, and some vendors (laboratory chemicals, for example) sell in packages priced just below common approval thresholds. The value of this test is that it confirms the Part II results. The same two cardholders lead the monthly spend, the split tests and the near-limit list. Seventeen and eighteen near-limit charges spread over many vendors is a pattern consistent with purchases being structured around the limit. Follow-up: for Employee B1FA2F0D and Employee 51914657, compare near-limit charges with the vendor invoices and with same-day charges at the same vendor.</w:t>
+        <w:t xml:space="preserve">Staying under a limit is not wrong in itself. The value of this test is that it confirms the Part II results. The same two cardholders lead the monthly spend, the split tests and the near-limit list. Seventeen and eighteen near-limit charges spread over many vendors is a pattern consistent with purchases being structured around the limit. Follow-up: for Employee B1FA2F0D and Employee 51914657, compare near-limit charges with the vendor invoices and with same-day charges at the same vendor.</w:t>
       </w:r>
     </w:p>
     <w:p>
@@ -22227,7 +22227,7 @@
           <w:sz w:val="20"/>
           <w:szCs w:val="20"/>
         </w:rPr>
-        <w:t xml:space="preserve">Several hits are obviously legitimate. Veterans Affairs DMC is a government agency, and NASA Catering looks like catering for a NASA-related programme, since the same cardholder also pays NASA's cafe. Two vendors stand out. The Royal Treatment, a health and beauty spa, received $8.020,00 in five charges, all from Employee 302B04AF. The same cardholder paid $85.742,57 in 2014 to dentists, chiropractors, eye care and other medical providers, and has the large eye care charges in Control 3. That is either an athletics or student health role that pays for care on behalf of students, or a serious personal-use case. TheLineupStore.com, a women's clothing store, received $7.757,31 from one cardholder. Follow-up: confirm Employee 302B04AF's department and role first, then the business purpose of the spa and clothing purchases.</w:t>
+        <w:t xml:space="preserve">Several hits are obviously legitimate. Veterans Affairs DMC is a government agency, and NASA Catering is probably tied to a NASA-funded project, but that needs confirming, since the same cardholder also pays NASA's cafe. Two vendors stand out. The Royal Treatment, a health and beauty spa, received $8.020,00 in five charges, all from Employee 302B04AF. The same cardholder paid $85.742,57 in 2014 to dentists, chiropractors, eye care and other medical providers, and has the large eye care charges in Control 3. That is either an athletics or student health role that pays for care on behalf of students, or a serious personal-use case. TheLineupStore.com, a women's clothing store, received $7.757,31 from one cardholder. Follow-up: confirm Employee 302B04AF's department and role first, then the business purpose of the spa and clothing purchases.</w:t>
       </w:r>
     </w:p>
     <w:p>

</xml_diff>